<commit_message>
fix(docs): balance page 3 text length and paragraph spacing so it fits completely without clipping
</commit_message>
<xml_diff>
--- a/Informe_Laboratorio_AWS.docx
+++ b/Informe_Laboratorio_AWS.docx
@@ -25,7 +25,7 @@
             <w:r>
               <w:drawing>
                 <wp:inline xmlns:a="http://schemas.openxmlformats.org/drawingml/2006/main" xmlns:pic="http://schemas.openxmlformats.org/drawingml/2006/picture">
-                  <wp:extent cx="1188720" cy="1160640"/>
+                  <wp:extent cx="1143000" cy="1116000"/>
                   <wp:docPr id="1" name="Picture 1"/>
                   <wp:cNvGraphicFramePr>
                     <a:graphicFrameLocks noChangeAspect="1"/>
@@ -46,7 +46,7 @@
                         <pic:spPr>
                           <a:xfrm>
                             <a:off x="0" y="0"/>
-                            <a:ext cx="1188720" cy="1160640"/>
+                            <a:ext cx="1143000" cy="1116000"/>
                           </a:xfrm>
                           <a:prstGeom prst="rect"/>
                         </pic:spPr>
@@ -69,7 +69,7 @@
             <w:r>
               <w:drawing>
                 <wp:inline xmlns:a="http://schemas.openxmlformats.org/drawingml/2006/main" xmlns:pic="http://schemas.openxmlformats.org/drawingml/2006/picture">
-                  <wp:extent cx="1188720" cy="1184095"/>
+                  <wp:extent cx="1143000" cy="1138553"/>
                   <wp:docPr id="2" name="Picture 2"/>
                   <wp:cNvGraphicFramePr>
                     <a:graphicFrameLocks noChangeAspect="1"/>
@@ -90,7 +90,7 @@
                         <pic:spPr>
                           <a:xfrm>
                             <a:off x="0" y="0"/>
-                            <a:ext cx="1188720" cy="1184095"/>
+                            <a:ext cx="1143000" cy="1138553"/>
                           </a:xfrm>
                           <a:prstGeom prst="rect"/>
                         </pic:spPr>
@@ -106,7 +106,7 @@
     </w:tbl>
     <w:p>
       <w:pPr>
-        <w:spacing w:before="400" w:after="400" w:line="288" w:lineRule="auto"/>
+        <w:spacing w:before="320" w:after="320" w:line="288" w:lineRule="auto"/>
         <w:jc w:val="center"/>
       </w:pPr>
       <w:r>
@@ -124,7 +124,7 @@
     </w:p>
     <w:p>
       <w:pPr>
-        <w:spacing w:after="800" w:line="312" w:lineRule="auto"/>
+        <w:spacing w:after="600" w:line="312" w:lineRule="auto"/>
         <w:jc w:val="center"/>
       </w:pPr>
       <w:r>
@@ -146,7 +146,7 @@
     </w:p>
     <w:p>
       <w:pPr>
-        <w:spacing w:after="800"/>
+        <w:spacing w:after="600"/>
         <w:jc w:val="center"/>
       </w:pPr>
       <w:r>
@@ -160,7 +160,7 @@
     </w:p>
     <w:p>
       <w:pPr>
-        <w:spacing w:after="1000" w:line="360" w:lineRule="auto"/>
+        <w:spacing w:after="700" w:line="336" w:lineRule="auto"/>
         <w:jc w:val="center"/>
       </w:pPr>
       <w:r>
@@ -206,7 +206,7 @@
     </w:p>
     <w:p>
       <w:pPr>
-        <w:spacing w:before="400"/>
+        <w:spacing w:before="300"/>
         <w:jc w:val="center"/>
       </w:pPr>
       <w:r>
@@ -272,7 +272,7 @@
     </w:p>
     <w:p>
       <w:pPr>
-        <w:spacing w:before="0" w:after="360"/>
+        <w:spacing w:before="0" w:after="280"/>
         <w:jc w:val="center"/>
       </w:pPr>
       <w:r>
@@ -286,7 +286,7 @@
     </w:p>
     <w:p>
       <w:pPr>
-        <w:spacing w:after="200" w:line="276" w:lineRule="auto"/>
+        <w:spacing w:after="160" w:line="276" w:lineRule="auto"/>
         <w:jc w:val="both"/>
       </w:pPr>
       <w:r>
@@ -294,12 +294,12 @@
           <w:rFonts w:ascii="Times New Roman" w:hAnsi="Times New Roman"/>
           <w:sz w:val="22"/>
         </w:rPr>
-        <w:t>La arquitectura desarrollada para la aplicación de tres capas se encuentra desplegada sobre Amazon Web Services (AWS) en la región de Ohio (us-east-2), utilizando una Virtual Private Cloud (VPC) con direccionamiento 10.0.0.0/16 distribuida en subredes públicas y privadas con el objetivo de garantizar aislamiento de red, seguridad perimetral y alta disponibilidad. El flujo comienza cuando los usuarios acceden a la aplicación web a través de Internet mediante el protocolo HTTP en el puerto estándar 80. Las solicitudes son recibidas e introducidas a la red interna de la nube por medio de un Internet Gateway (igw-laboratorio), el cual proporciona el punto de enlace bidireccional entre la VPC y la red pública de Internet.</w:t>
+        <w:t>La arquitectura desarrollada para la aplicación de tres capas se encuentra desplegada en AWS en la región de Ohio (us-east-2), utilizando una VPC con direccionamiento 10.0.0.0/16 distribuida en subredes públicas y privadas con el propósito de garantizar seguridad perimetral y aislamiento de red. El flujo inicia cuando los usuarios externos acceden a la aplicación mediante peticiones HTTP en el puerto estándar 80. Las solicitudes son recibidas e introducidas a la red interna a través del Internet Gateway (igw-laboratorio), punto de enlace entre la VPC y la red pública.</w:t>
       </w:r>
     </w:p>
     <w:p>
       <w:pPr>
-        <w:spacing w:after="200" w:line="276" w:lineRule="auto"/>
+        <w:spacing w:after="160" w:line="276" w:lineRule="auto"/>
         <w:jc w:val="both"/>
       </w:pPr>
       <w:r>
@@ -307,12 +307,12 @@
           <w:rFonts w:ascii="Times New Roman" w:hAnsi="Times New Roman"/>
           <w:sz w:val="22"/>
         </w:rPr>
-        <w:t>En estricto cumplimiento con las restricciones técnicas del laboratorio, la arquitectura prescinde totalmente del uso de un Application Load Balancer (ALB). Para resolver el enrutamiento y la distribución de solicitudes sin dicho balanceador, la capa de presentación fue implementada utilizando un contenedor ligero basado en Nginx Alpine sobre AWS Fargate, ubicado estratégicamente en una subred pública (10.0.1.0/24) con una dirección IP pública estática asignada (18.227.81.116). Nginx desempeña una doble función arquitectónica crítica: por un lado, sirve los recursos estáticos de la interfaz web (HTML5, estilos CSS3 modernos con diseño oscuro y scripts de JavaScript asíncrono para manipulación dinámica del DOM); y por otro lado, opera como un Reverse Proxy de capa 7 de alto rendimiento, interceptando de forma transparente todas las solicitudes dirigidas al prefijo de ruta /api/* y reexpidiéndolas directamente hacia el backend.</w:t>
+        <w:t>En cumplimiento con la restricción técnica de no utilizar un Application Load Balancer (ALB), la capa de presentación se resolvió mediante un contenedor Nginx Alpine sobre AWS Fargate, situado en una subred pública (10.0.1.0/24) con IP pública (18.227.81.116). Nginx cumple una doble función esencial: sirve los archivos estáticos de la interfaz web (HTML5, CSS3 y JavaScript asíncrono) y opera simultáneamente como Reverse Proxy de capa 7, interceptando de forma transparente las peticiones dirigidas a la ruta /api/* para reenviarlas directamente hacia el backend.</w:t>
       </w:r>
     </w:p>
     <w:p>
       <w:pPr>
-        <w:spacing w:after="200" w:line="276" w:lineRule="auto"/>
+        <w:spacing w:after="160" w:line="276" w:lineRule="auto"/>
         <w:jc w:val="both"/>
       </w:pPr>
       <w:r>
@@ -320,12 +320,12 @@
           <w:rFonts w:ascii="Times New Roman" w:hAnsi="Times New Roman"/>
           <w:sz w:val="22"/>
         </w:rPr>
-        <w:t>Una vez interceptada la petición API, el tráfico es reenviado de manera directa y privada hacia la capa de aplicación, la cual reside en una subred privada (10.0.2.0/24) y carece de dirección IP pública, impidiendo cualquier intento de acceso directo no autorizado desde el exterior. La resolución de nombres y la comunicación directa de servicio a servicio se articulan mediante el mecanismo nativo de AWS Cloud Map y ECS Service Connect bajo el espacio de nombres privado laboratorio.local. De este modo, el contenedor frontend se comunica internamente con el backend mediante el nombre de descubrimiento backend:3000. Este servicio ejecuta una API REST desarrollada en Node.js con el framework Express, encargada de la lógica de negocio, validación de parámetros y procesamiento de los endpoints GET /api/items (consulta de catálogo) y POST /api/items (creación de nuevos productos).</w:t>
+        <w:t>El tráfico API es enrutado de forma interna hacia la capa de aplicación, la cual reside en una subred privada (10.0.2.0/24) desprovista de IP pública para impedir cualquier acceso directo no autorizado. La comunicación de servicio a servicio se articula mediante AWS Cloud Map y ECS Service Connect bajo el namespace privado laboratorio.local. De este modo, el frontend invoca de forma directa al backend (backend:3000), donde un servicio Node.js Express procesa la lógica de negocio y atiende las operaciones GET y POST /api/items.</w:t>
       </w:r>
     </w:p>
     <w:p>
       <w:pPr>
-        <w:spacing w:after="200" w:line="276" w:lineRule="auto"/>
+        <w:spacing w:after="160" w:line="276" w:lineRule="auto"/>
         <w:jc w:val="both"/>
       </w:pPr>
       <w:r>
@@ -333,12 +333,12 @@
           <w:rFonts w:ascii="Times New Roman" w:hAnsi="Times New Roman"/>
           <w:sz w:val="22"/>
         </w:rPr>
-        <w:t>Para la capa de persistencia y almacenamiento relacional, el backend interactúa con una instancia de Amazon RDS con motor PostgreSQL versión 18.3 (db.t3.micro), emplazada en subredes privadas de datos (10.0.3.0/24 y 10.0.4.0/24). La base de datos está asociada a un DB Subnet Group (dbsng-laboratorio) que abarca dos Zonas de Disponibilidad (us-east-2a y us-east-2b), preparando la infraestructura para alta disponibilidad y resiliencia ante contingencias físicas mediante redundancia Multi-AZ. La instancia aloja la base de datos appdb y la tabla items, cuyo esquema incorpora un identificador autoincremental (id SERIAL PRIMARY KEY), campos de negocio (nombre, descripcion, precio) y una columna de auditoría (fecha_creacion TIMESTAMP DEFAULT NOW()). Este modelo relacional desacoplado garantiza la persistencia definitiva de los datos en volúmenes EBS administrados por AWS, asegurando que la información permanezca inmutable e íntegra independientemente del ciclo de vida efímero de los contenedores Fargate.</w:t>
+        <w:t>Para la persistencia de datos, el backend se conecta mediante TCP en el puerto 5432 con una instancia de Amazon RDS PostgreSQL 18.3 (db.t3.micro), ubicada en subredes privadas de datos (10.0.3.0/24 y 10.0.4.0/24). La base de datos está asociada a un DB Subnet Group (dbsng-laboratorio) que abarca dos Zonas de Disponibilidad (us-east-2a y us-east-2b) para alta disponibilidad. La tabla items gestiona los registros con clave primaria autoincremental y fecha de auditoría, garantizando la persistencia definitiva de la información en volúmenes EBS administrados, aun tras reinicios de los contenedores.</w:t>
       </w:r>
     </w:p>
     <w:p>
       <w:pPr>
-        <w:spacing w:after="200" w:line="276" w:lineRule="auto"/>
+        <w:spacing w:after="160" w:line="276" w:lineRule="auto"/>
         <w:jc w:val="both"/>
       </w:pPr>
       <w:r>
@@ -346,20 +346,7 @@
           <w:rFonts w:ascii="Times New Roman" w:hAnsi="Times New Roman"/>
           <w:sz w:val="22"/>
         </w:rPr>
-        <w:t>Debido a que las tareas de AWS Fargate en la subred privada no disponen de direcciones IP públicas para interactuar con servicios externos, se desplegó un NAT Gateway (nat-laboratorio) en la subred pública asociado a una Elastic IP dedicada (16.58.232.26), enrutando el tráfico de egreso (0.0.0.0/0) mediante tablas de ruteo personalizadas. Esto permite a las tareas privadas descargar de forma segura las imágenes de contenedor alojadas en los repositorios privados de Amazon ECR (laboratorio-backend y laboratorio-frontend) e instalar dependencias necesarias. Asimismo, se configuró el controlador de registros nativo de AWS (awslogs) para canalizar en tiempo real todas las salidas estándar y de error de los contenedores hacia grupos de registros unificados en Amazon CloudWatch (/ecs/laboratorio-*), posibilitando la auditoría operativa, métricas de rendimiento y trazabilidad de eventos.</w:t>
-      </w:r>
-    </w:p>
-    <w:p>
-      <w:pPr>
-        <w:spacing w:after="200" w:line="276" w:lineRule="auto"/>
-        <w:jc w:val="both"/>
-      </w:pPr>
-      <w:r>
-        <w:rPr>
-          <w:rFonts w:ascii="Times New Roman" w:hAnsi="Times New Roman"/>
-          <w:sz w:val="22"/>
-        </w:rPr>
-        <w:t>La seguridad integral de la solución se encuentra gobernada por el principio de mínimo privilegio implementado a través de Security Groups: frontend-sg únicamente permite tráfico entrante en el puerto 80 desde cualquier origen (0.0.0.0/0); backend-sg restringe estrictamente el tráfico entrante en el puerto 3000 admitiendo de forma exclusiva conexiones originadas desde el identificador de frontend-sg; y rds-sg restringe el puerto 5432 permitiendo únicamente conexiones provenientes de backend-sg. Las credenciales de acceso a la base de datos no se encuentran incrustadas en el código fuente, sino que se inyectan de forma dinámica en tiempo de ejecución como variables de entorno seguras. En conjunto, esta arquitectura desacoplada en contenedores sobre AWS Fargate y RDS proporciona una solución moderna, altamente escalable, costo-eficiente y con tolerancia a fallos que satisface con creces todos los lineamientos y objetivos pedagógicos del laboratorio.</w:t>
+        <w:t>Finalmente, los contenedores en subredes privadas descargan imágenes desde repositorios de Amazon ECR mediante un NAT Gateway (nat-laboratorio) con Elastic IP (16.58.232.26). Amazon CloudWatch centraliza los registros de logs (/ecs/laboratorio-*), mientras que Security Groups dedicados (frontend-sg, backend-sg y rds-sg) gobiernan el tráfico limitando los accesos bajo el principio de mínimo privilegio e inyectando credenciales por variables de entorno seguras. Esta arquitectura desacoplada proporciona una solución escalable, modular y resiliente.</w:t>
       </w:r>
     </w:p>
     <w:sectPr>

</xml_diff>